<commit_message>
Issue #15: report draft v2 + verified flip annotations + video brief
Co-Authored-By: Claude Opus 4.6 (1M context) <noreply@anthropic.com>
</commit_message>
<xml_diff>
--- a/report/report_draft.docx
+++ b/report/report_draft.docx
@@ -79,7 +79,7 @@
         <w:jc w:val="both"/>
       </w:pPr>
       <w:r>
-        <w:t xml:space="preserve">Modern large language models challenge this convention. They consume text through subword tokenizers (BPE and variants) trained on raw, unsegmented corpora, and they appear to handle Hebrew reasonably well without any explicit morphological preprocessing. This project revisits the classic question in the LLM era:</w:t>
+        <w:t xml:space="preserve">Modern large language models challenge this convention. They consume text through subword tokenizers (BPE and variants) trained on raw, unsegmented corpora, and they appear to handle Hebrew reasonably well without explicit morphological preprocessing. This project revisits the classic question in the LLM era:</w:t>
       </w:r>
     </w:p>
     <w:p>
@@ -114,7 +114,7 @@
         <w:jc w:val="both"/>
       </w:pPr>
       <w:r>
-        <w:t xml:space="preserve">We answer these questions with a systematic 4×3×3 experiment: four LLMs (GPT-4o, Claude, LLaMA 3.2 3B Instruct, Mistral 7B Instruct) evaluated on three Hebrew tasks (sentiment analysis, natural language inference, and extractive question answering) under three input conditions (raw text, YAP-segmented text, and prompt-guided morphology), totaling roughly 22,600 model predictions. Beyond aggregate metrics, we contribute a paired statistical analysis (McNemar tests), a flip analysis linking answer changes to morphological properties of the input, a tokenizer fertility analysis that explains the results mechanistically, and the identification of a subtle evaluation artifact that inflates the apparent harm of segmentation in extractive QA.</w:t>
+        <w:t xml:space="preserve">We answer these questions with a systematic 4×3×3 experiment: four LLMs (GPT-4o, Claude, LLaMA 3.2 3B Instruct, Mistral 7B Instruct) evaluated on three Hebrew tasks (sentiment analysis, natural language inference, and extractive question answering) under three input conditions (raw text, YAP-segmented text, and prompt-guided morphology), totaling roughly 22,600 model predictions. Beyond aggregate metrics, we contribute paired statistical analysis (exact McNemar tests), a flip analysis linking answer changes to morphological properties of the input, a tokenizer fertility analysis that explains the results mechanistically, and — a methodological contribution in its own right — the identification and correction of two evaluation artifacts that initially exaggerated the harm of segmentation: a span-spacing artifact in extractive QA, and a thinking-budget artifact in which a reasoning model returned empty answers on unfamiliar input.</w:t>
       </w:r>
     </w:p>
     <w:p>
@@ -130,7 +130,7 @@
         <w:t xml:space="preserve">Our answer to RQ1 is no: </w:t>
       </w:r>
       <w:r>
-        <w:t xml:space="preserve">raw Hebrew is the best input condition for every model on nearly every task, and segmentation causes statistically significant degradation on NLI for all four models. Our answer to RQ2 is that there is no benefit to substitute: the morphology instruction is null-to-harmful, and its effect is strongly model-dependent.</w:t>
+        <w:t xml:space="preserve">raw Hebrew is the best input condition for every model on nearly every task. Segmentation never helps significantly; it significantly degrades NLI for three of four models (all four directionally) and QA for all four. Our answer to RQ2 is that there is no benefit to substitute: the morphology instruction is null for frontier models and significantly harmful for the small models — prompt-based linguistic scaffolding does not transfer.</w:t>
       </w:r>
     </w:p>
     <w:p>
@@ -229,7 +229,7 @@
           <w:ilvl w:val="0"/>
           <w:numId w:val="2"/>
         </w:numPr>
-        <w:spacing w:after="120"/>
+        <w:spacing w:after="60"/>
       </w:pPr>
       <w:r>
         <w:t xml:space="preserve">QA — Etelis/HeQ_v1: SQuAD-style reading comprehension over Hebrew Wikipedia and Geektime. We use 500 answerable test questions, sampled uniformly.</w:t>
@@ -295,7 +295,7 @@
           <w:ilvl w:val="0"/>
           <w:numId w:val="2"/>
         </w:numPr>
-        <w:spacing w:after="120"/>
+        <w:spacing w:after="60"/>
       </w:pPr>
       <w:r>
         <w:t xml:space="preserve">prompt_guided (novel) — raw text plus a natural-language instruction telling the model that Hebrew words bundle clitic prefixes and suffixes and asking it to mentally decompose each word before answering.</w:t>
@@ -1117,7 +1117,7 @@
         <w:jc w:val="both"/>
       </w:pPr>
       <w:r>
-        <w:t xml:space="preserve">GPT-4o (OpenAI API) and Claude (Anthropic API) represent frontier commercial models; LLaMA 3.2 3B Instruct and Mistral 7B Instruct (HuggingFace weights, run on a Colab T4 GPU in fp16) represent small open models. All models are evaluated zero-shot with frozen weights and deterministic (greedy / temperature-0) decoding — no fine-tuning — so differences between conditions stem purely from input presentation. Instructions are in English with Hebrew text embedded; answers are constrained to a single English label (classification) or a copied Hebrew span (QA) and parsed strictly, with ambiguous outputs counted as errors. Parse-failure rates were ≤1.2% in every one of the 36 model×task×condition cells.</w:t>
+        <w:t xml:space="preserve">GPT-4o (OpenAI API) and Claude (Anthropic API) represent frontier commercial models; LLaMA 3.2 3B Instruct and Mistral 7B Instruct (HuggingFace weights, run on a Colab T4 GPU in fp16) represent small open models. All models are evaluated zero-shot with frozen weights and deterministic (greedy / temperature-0) decoding — no fine-tuning — so differences between conditions stem purely from input presentation. For Claude, a reasoning-capable model, extended thinking is explicitly disabled (Section 5.3 documents why). Instructions are in English with Hebrew text embedded; answers are constrained to a single English label (classification) or a copied Hebrew span (QA) and parsed strictly, with ambiguous outputs counted as errors. Parse-failure rates are ≤1.2% in every one of the 36 model×task×condition cells.</w:t>
       </w:r>
     </w:p>
     <w:p>
@@ -1135,7 +1135,7 @@
         <w:jc w:val="both"/>
       </w:pPr>
       <w:r>
-        <w:t xml:space="preserve">Every prediction is stored as a JSONL record containing the exact prompt, raw model output, parsed label, and gold answer. All API calls pass through a SQLite response cache keyed by prompt hash; runs are resumable by example id (crash-safe append-and-flush), which allowed the GPU sweeps to survive Colab preemptions without losing or duplicating work. One pathological 2,276-token comment exceeded T4 memory with Mistral and was truncated head+tail to 2,048 tokens (documented; single example). Total commercial API spend for all experiments was under $40. [TODO: replace with exact spend from billing dashboards]</w:t>
+        <w:t xml:space="preserve">Every prediction is stored as a JSONL record containing the exact prompt, raw model output, parsed label, and gold answer. All API calls pass through a SQLite response cache keyed by prompt hash; runs are resumable by example id (crash-safe append-and-flush), which allowed the GPU sweeps to survive Colab preemptions without losing or duplicating work. An automated audit validates all 36 result files for duplicates, empty outputs, degenerate predictions, prompt-condition integrity, and cross-condition id/gold consistency. One pathological 2,276-token comment exceeded T4 memory with Mistral and was truncated head+tail to 2,048 tokens (documented; single example). Total commercial API spend for all experiments was under $40. [TODO: replace with exact spend from billing dashboards]</w:t>
       </w:r>
     </w:p>
     <w:p>
@@ -1153,7 +1153,7 @@
         <w:jc w:val="both"/>
       </w:pPr>
       <w:r>
-        <w:t xml:space="preserve">Tables 2–4 present the primary metric per task (accuracy for classification, exact match for QA) under all three conditions, with deltas versus raw and exact two-sided McNemar p-values on the paired predictions. Bold p-values are significant at α=0.05.</w:t>
+        <w:t xml:space="preserve">Tables 2–4 present the primary metric per task (accuracy for classification, exact match for QA) under all three conditions, with deltas versus raw and exact two-sided McNemar p-values on the paired predictions. Bold/starred p-values are significant at α=0.05.</w:t>
       </w:r>
     </w:p>
     <w:p>
@@ -1676,7 +1676,7 @@
                 <w:sz w:val="18"/>
                 <w:szCs w:val="18"/>
               </w:rPr>
-              <w:t xml:space="preserve">0.814</w:t>
+              <w:t xml:space="preserve">0.824</w:t>
             </w:r>
           </w:p>
         </w:tc>
@@ -1701,7 +1701,7 @@
                 <w:sz w:val="18"/>
                 <w:szCs w:val="18"/>
               </w:rPr>
-              <w:t xml:space="preserve">−0.008</w:t>
+              <w:t xml:space="preserve">+0.002</w:t>
             </w:r>
           </w:p>
         </w:tc>
@@ -1726,7 +1726,7 @@
                 <w:sz w:val="18"/>
                 <w:szCs w:val="18"/>
               </w:rPr>
-              <w:t xml:space="preserve">0.557</w:t>
+              <w:t xml:space="preserve">1.000</w:t>
             </w:r>
           </w:p>
         </w:tc>
@@ -1751,7 +1751,7 @@
                 <w:sz w:val="18"/>
                 <w:szCs w:val="18"/>
               </w:rPr>
-              <w:t xml:space="preserve">0.752</w:t>
+              <w:t xml:space="preserve">0.820</w:t>
             </w:r>
           </w:p>
         </w:tc>
@@ -1776,7 +1776,7 @@
                 <w:sz w:val="18"/>
                 <w:szCs w:val="18"/>
               </w:rPr>
-              <w:t xml:space="preserve">−0.070</w:t>
+              <w:t xml:space="preserve">−0.002</w:t>
             </w:r>
           </w:p>
         </w:tc>
@@ -1801,7 +1801,7 @@
                 <w:sz w:val="18"/>
                 <w:szCs w:val="18"/>
               </w:rPr>
-              <w:t xml:space="preserve">&lt;0.0001</w:t>
+              <w:t xml:space="preserve">1.000</w:t>
             </w:r>
           </w:p>
         </w:tc>
@@ -2609,7 +2609,7 @@
                 <w:sz w:val="18"/>
                 <w:szCs w:val="18"/>
               </w:rPr>
-              <w:t xml:space="preserve">0.860</w:t>
+              <w:t xml:space="preserve">0.857</w:t>
             </w:r>
           </w:p>
         </w:tc>
@@ -2634,7 +2634,7 @@
                 <w:sz w:val="18"/>
                 <w:szCs w:val="18"/>
               </w:rPr>
-              <w:t xml:space="preserve">−0.025</w:t>
+              <w:t xml:space="preserve">−0.027</w:t>
             </w:r>
           </w:p>
         </w:tc>
@@ -2711,7 +2711,7 @@
                 <w:sz w:val="18"/>
                 <w:szCs w:val="18"/>
               </w:rPr>
-              <w:t xml:space="preserve">0.876</w:t>
+              <w:t xml:space="preserve">0.914</w:t>
             </w:r>
           </w:p>
         </w:tc>
@@ -2736,7 +2736,7 @@
                 <w:sz w:val="18"/>
                 <w:szCs w:val="18"/>
               </w:rPr>
-              <w:t xml:space="preserve">0.688</w:t>
+              <w:t xml:space="preserve">0.891</w:t>
             </w:r>
           </w:p>
         </w:tc>
@@ -2761,7 +2761,7 @@
                 <w:sz w:val="18"/>
                 <w:szCs w:val="18"/>
               </w:rPr>
-              <w:t xml:space="preserve">−0.188</w:t>
+              <w:t xml:space="preserve">−0.023</w:t>
             </w:r>
           </w:p>
         </w:tc>
@@ -2786,7 +2786,7 @@
                 <w:sz w:val="18"/>
                 <w:szCs w:val="18"/>
               </w:rPr>
-              <w:t xml:space="preserve">&lt;0.0001</w:t>
+              <w:t xml:space="preserve">0.0169</w:t>
             </w:r>
           </w:p>
         </w:tc>
@@ -2811,7 +2811,7 @@
                 <w:sz w:val="18"/>
                 <w:szCs w:val="18"/>
               </w:rPr>
-              <w:t xml:space="preserve">0.641</w:t>
+              <w:t xml:space="preserve">0.900</w:t>
             </w:r>
           </w:p>
         </w:tc>
@@ -2836,7 +2836,7 @@
                 <w:sz w:val="18"/>
                 <w:szCs w:val="18"/>
               </w:rPr>
-              <w:t xml:space="preserve">−0.235</w:t>
+              <w:t xml:space="preserve">−0.014</w:t>
             </w:r>
           </w:p>
         </w:tc>
@@ -2861,7 +2861,7 @@
                 <w:sz w:val="18"/>
                 <w:szCs w:val="18"/>
               </w:rPr>
-              <w:t xml:space="preserve">&lt;0.0001</w:t>
+              <w:t xml:space="preserve">0.155</w:t>
             </w:r>
           </w:p>
         </w:tc>
@@ -3669,7 +3669,7 @@
                 <w:sz w:val="18"/>
                 <w:szCs w:val="18"/>
               </w:rPr>
-              <w:t xml:space="preserve">0.653</w:t>
+              <w:t xml:space="preserve">0.648</w:t>
             </w:r>
           </w:p>
         </w:tc>
@@ -3694,7 +3694,7 @@
                 <w:sz w:val="18"/>
                 <w:szCs w:val="18"/>
               </w:rPr>
-              <w:t xml:space="preserve">+0.025</w:t>
+              <w:t xml:space="preserve">+0.020</w:t>
             </w:r>
           </w:p>
         </w:tc>
@@ -3771,7 +3771,7 @@
                 <w:sz w:val="18"/>
                 <w:szCs w:val="18"/>
               </w:rPr>
-              <w:t xml:space="preserve">0.652</w:t>
+              <w:t xml:space="preserve">0.700</w:t>
             </w:r>
           </w:p>
         </w:tc>
@@ -3796,7 +3796,7 @@
                 <w:sz w:val="18"/>
                 <w:szCs w:val="18"/>
               </w:rPr>
-              <w:t xml:space="preserve">0.432</w:t>
+              <w:t xml:space="preserve">0.478</w:t>
             </w:r>
           </w:p>
         </w:tc>
@@ -3821,7 +3821,7 @@
                 <w:sz w:val="18"/>
                 <w:szCs w:val="18"/>
               </w:rPr>
-              <w:t xml:space="preserve">−0.220</w:t>
+              <w:t xml:space="preserve">−0.222</w:t>
             </w:r>
           </w:p>
         </w:tc>
@@ -3871,7 +3871,7 @@
                 <w:sz w:val="18"/>
                 <w:szCs w:val="18"/>
               </w:rPr>
-              <w:t xml:space="preserve">0.611</w:t>
+              <w:t xml:space="preserve">0.682</w:t>
             </w:r>
           </w:p>
         </w:tc>
@@ -3896,7 +3896,7 @@
                 <w:sz w:val="18"/>
                 <w:szCs w:val="18"/>
               </w:rPr>
-              <w:t xml:space="preserve">−0.041</w:t>
+              <w:t xml:space="preserve">−0.018</w:t>
             </w:r>
           </w:p>
         </w:tc>
@@ -3921,7 +3921,7 @@
                 <w:sz w:val="18"/>
                 <w:szCs w:val="18"/>
               </w:rPr>
-              <w:t xml:space="preserve">0.0066</w:t>
+              <w:t xml:space="preserve">0.243</w:t>
             </w:r>
           </w:p>
         </w:tc>
@@ -4355,7 +4355,7 @@
         <w:spacing w:after="60"/>
       </w:pPr>
       <w:r>
-        <w:t xml:space="preserve">Raw Hebrew wins. No model on any task is significantly improved by either intervention. On NLI, segmentation significantly degrades all four models; prompt-guided morphology significantly degrades all four models on at least one task.</w:t>
+        <w:t xml:space="preserve">Raw Hebrew wins. No model is significantly improved by either intervention on any task. Segmentation significantly degrades NLI for three of four models (all four directionally) and QA for all four; sentiment is unaffected for all models.</w:t>
       </w:r>
     </w:p>
     <w:p>
@@ -4368,7 +4368,7 @@
         <w:spacing w:after="60"/>
       </w:pPr>
       <w:r>
-        <w:t xml:space="preserve">Claude is the most morphology-sensitive model. Segmentation costs it 18.8 points on NLI and the morphology instruction costs it 23.5 points on NLI and 7.0 on sentiment (all p&lt;0.0001) — the strongest Hebrew performer is the one most damaged by imposed morphological structure.</w:t>
+        <w:t xml:space="preserve">Effect sizes scale inversely with model strength. For the frontier models the real NLI cost of segmentation is modest (GPT-4o −3.8, Claude −2.3 points); for the small models the prompt-guided instruction is the most harmful condition (LLaMA: −8.3 NLI, −11.4 QA, both p&lt;0.0001).</w:t>
       </w:r>
     </w:p>
     <w:p>
@@ -4381,7 +4381,7 @@
         <w:spacing w:after="60"/>
       </w:pPr>
       <w:r>
-        <w:t xml:space="preserve">The novel condition is null-to-harmful. For GPT-4o, prompt-guided morphology is statistically indistinguishable from raw on sentiment and QA; for Claude and LLaMA it is actively harmful. The instruction was selected in a GPT-4o pilot and does not transfer to other models — prompt-based linguistic scaffolding is model-dependent.</w:t>
+        <w:t xml:space="preserve">The novel condition is null for frontier models and harmful for small ones. GPT-4o and Claude are statistically unaffected by the morphology instruction on sentiment and QA (Claude also on NLI); LLaMA is significantly harmed on NLI and QA. The instruction was selected in a GPT-4o pilot and does not transfer downward — prompt-based linguistic scaffolding is model-dependent.</w:t>
       </w:r>
     </w:p>
     <w:p>
@@ -4391,10 +4391,10 @@
           <w:ilvl w:val="0"/>
           <w:numId w:val="2"/>
         </w:numPr>
-        <w:spacing w:after="120"/>
-      </w:pPr>
-      <w:r>
-        <w:t xml:space="preserve">The only (non-significant) positive signal: small-model sentiment. LLaMA gains +1.4 (segmented) and +2.2 (prompt-guided) points on sentiment with net-positive flips — a direction worth noting but not statistical evidence.</w:t>
+        <w:spacing w:after="60"/>
+      </w:pPr>
+      <w:r>
+        <w:t xml:space="preserve">The only (non-significant) positive signal: small-model sentiment. LLaMA gains +1.4 (segmented) and +2.2 (prompt-guided) points on sentiment with net-positive flips — a consistent direction worth noting, but not statistical evidence.</w:t>
       </w:r>
     </w:p>
     <w:p>
@@ -4403,7 +4403,7 @@
         <w:spacing w:after="100" w:before="220"/>
       </w:pPr>
       <w:r>
-        <w:t xml:space="preserve">5.2 The QA spacing artifact</w:t>
+        <w:t xml:space="preserve">5.2 Evaluation artifact I: QA span spacing</w:t>
       </w:r>
     </w:p>
     <w:p>
@@ -4412,7 +4412,7 @@
         <w:jc w:val="both"/>
       </w:pPr>
       <w:r>
-        <w:t xml:space="preserve">A large part of the apparent QA collapse under segmentation is an evaluation artifact, not comprehension loss. In the segmented condition, models copy answer spans from segmented context (e.g., ב ירושלים), which fail exact-match against raw-form gold answers (בירושלים). Rescoring with space-insensitive exact match, GPT-4o’s segmented EM rises from 0.424 to 0.600 (vs raw 0.628) and Claude’s from 0.432 to 0.592 (vs 0.652): roughly 80% of the apparent drop is spacing. The artifact-corrected picture is a modest real degradation of 3–6 points. LLaMA shows almost no such gap (0.280→0.292), indicating it was not faithfully copying segmented spans in the first place.</w:t>
+        <w:t xml:space="preserve">A large part of the apparent QA collapse under segmentation is an evaluation artifact, not comprehension loss. In the segmented condition, models copy answer spans from segmented context (e.g., ב ירושלים), which fail exact-match against raw-form gold answers (בירושלים). Rescoring with space-insensitive exact match, GPT-4o’s segmented EM rises from 0.424 to 0.600 (vs raw 0.628) and Claude’s from 0.478 to 0.654 (vs 0.700): most of the apparent 20-point drop is spacing, and the artifact-corrected real degradation is 3–5 points. LLaMA shows almost no such gap (0.280→0.292), indicating it was not faithfully copying segmented spans in the first place.</w:t>
       </w:r>
     </w:p>
     <w:p>
@@ -4702,7 +4702,7 @@
                 <w:sz w:val="18"/>
                 <w:szCs w:val="18"/>
               </w:rPr>
-              <w:t xml:space="preserve">0.652</w:t>
+              <w:t xml:space="preserve">0.700</w:t>
             </w:r>
           </w:p>
         </w:tc>
@@ -4727,7 +4727,7 @@
                 <w:sz w:val="18"/>
                 <w:szCs w:val="18"/>
               </w:rPr>
-              <w:t xml:space="preserve">0.432</w:t>
+              <w:t xml:space="preserve">0.478</w:t>
             </w:r>
           </w:p>
         </w:tc>
@@ -4752,7 +4752,7 @@
                 <w:sz w:val="18"/>
                 <w:szCs w:val="18"/>
               </w:rPr>
-              <w:t xml:space="preserve">0.592</w:t>
+              <w:t xml:space="preserve">0.654</w:t>
             </w:r>
           </w:p>
         </w:tc>
@@ -4969,6 +4969,24 @@
     </w:p>
     <w:p>
       <w:pPr>
+        <w:pStyle w:val="Heading2"/>
+        <w:spacing w:after="100" w:before="220"/>
+      </w:pPr>
+      <w:r>
+        <w:t xml:space="preserve">5.3 Evaluation artifact II: thinking-budget starvation</w:t>
+      </w:r>
+    </w:p>
+    <w:p>
+      <w:pPr>
+        <w:spacing w:after="120"/>
+        <w:jc w:val="both"/>
+      </w:pPr>
+      <w:r>
+        <w:t xml:space="preserve">Our first full run produced a dramatic headline — Claude losing 18.8 NLI points under segmentation — that turned out to be almost entirely an artifact. Claude is a reasoning model that emits internal “thinking” tokens before its visible answer; under our tight answer budgets (8 tokens for classification), thinking could consume the entire budget and yield an empty response, which our strict scorer counted as an error. Crucially, this happened far more often on manipulated input: on NLI, 5.3% of raw inputs produced empty responses versus 26.2% of segmented inputs (QA: 18.0% vs 27.2%). After disabling extended thinking and re-running the affected examples, Claude’s segmented NLI “collapse” shrank from −18.8 to −2.3 points. We draw two lessons. Methodologically: when evaluating reasoning models with constrained output budgets, empty responses must be detected and handled, or they silently masquerade as task errors. Scientifically: the empty-response rate is itself a signal — morphologically manipulated input made the model think measurably longer, i.e., increased processing effort even where final accuracy was ultimately unaffected.</w:t>
+      </w:r>
+    </w:p>
+    <w:p>
+      <w:pPr>
         <w:pStyle w:val="Heading1"/>
         <w:spacing w:after="140" w:before="280"/>
       </w:pPr>
@@ -4991,7 +5009,7 @@
         <w:jc w:val="both"/>
       </w:pPr>
       <w:r>
-        <w:t xml:space="preserve">For each model×task we identify examples whose correctness flipped between raw and each condition. Flips are overwhelmingly harmful: pooled across models, the segmented condition produces 454 harmful vs 185 helpful flips on NLI and 385 vs 98 on QA. The most extreme case is Claude×NLI: 176 harmful vs 10 helpful flips under segmentation, and 238 vs 7 under the morphology instruction.</w:t>
+        <w:t xml:space="preserve">For each model×task we identify examples whose correctness flipped between raw and each condition. Flips are predominantly harmful: pooled across models, the segmented condition produces 320 harmful vs 197 helpful flips on NLI and 392 vs 104 on QA. For Claude on NLI the corrected ratio is 42 harmful vs 22 helpful under segmentation — a real but moderate asymmetry, in sharp contrast to the artifact-inflated pre-correction figures.</w:t>
       </w:r>
     </w:p>
     <w:p>
@@ -5009,7 +5027,7 @@
         <w:jc w:val="both"/>
       </w:pPr>
       <w:r>
-        <w:t xml:space="preserve">We computed morphological features of every example from its YAP output (expansion ratio; clitic-prefix density). On sentiment, harm concentrates in heavily-segmented examples: harmful flips average expansion 1.69 vs 1.51 for stable examples, while helpful flips average 1.43. On NLI and QA, however, flipped and stable examples are morphologically indistinguishable (e.g., NLI: 1.59 vs 1.59). The degradation there is therefore not concentrated where morphology is complex — it behaves like a uniform distribution shift: models simply read Hebrew worse when its spacing no longer matches the distribution they were trained on.</w:t>
+        <w:t xml:space="preserve">We computed morphological features of every example from its YAP output (expansion ratio; clitic-prefix density). On sentiment, harm concentrates in heavily-segmented examples: harmful flips average expansion 1.70 vs 1.51 for stable examples, while helpful flips average 1.43. On NLI and QA, however, flipped and stable examples are morphologically indistinguishable (e.g., NLI: 1.60 vs 1.59). The degradation there is therefore not concentrated where morphology is complex — it behaves like a uniform distribution shift: models simply read Hebrew worse when its spacing no longer matches the distribution they were trained on.</w:t>
       </w:r>
     </w:p>
     <w:p>
@@ -5027,7 +5045,59 @@
         <w:jc w:val="both"/>
       </w:pPr>
       <w:r>
-        <w:t xml:space="preserve">[TODO: 2–3 annotated examples from analysis/flip_examples.md — pick harmful Claude NLI flips and explain in one sentence each what the segmented rendering changed. Native-speaker annotation needed.]</w:t>
+        <w:t xml:space="preserve">Native-speaker inspection of harmful Claude×NLI flips (annotated in analysis/flip_annotations.md) reveals a four-way taxonomy of how segmentation causes errors:</w:t>
+      </w:r>
+    </w:p>
+    <w:p>
+      <w:pPr>
+        <w:pStyle w:val="ListParagraph"/>
+        <w:numPr>
+          <w:ilvl w:val="0"/>
+          <w:numId w:val="2"/>
+        </w:numPr>
+        <w:spacing w:after="60"/>
+      </w:pPr>
+      <w:r>
+        <w:t xml:space="preserve">Meaning-changing normalization. In nli-163, YAP rendered לעולם ("ever", idiomatic under negation: "one must never ignore reality") as ל ה עולם — literally "to the world" — erasing the temporal idiom. The model answered a hypothesis that no longer says what its author wrote.</w:t>
+      </w:r>
+    </w:p>
+    <w:p>
+      <w:pPr>
+        <w:pStyle w:val="ListParagraph"/>
+        <w:numPr>
+          <w:ilvl w:val="0"/>
+          <w:numId w:val="2"/>
+        </w:numPr>
+        <w:spacing w:after="60"/>
+      </w:pPr>
+      <w:r>
+        <w:t xml:space="preserve">Segmenter error destroying a content word. In nli-178, מקורם ("their origin", stem מקור + possessive ם) was mis-split as מ קורם, treating the initial מ as the preposition "from" and leaving a non-word — the concept carrying the entire question vanished.</w:t>
+      </w:r>
+    </w:p>
+    <w:p>
+      <w:pPr>
+        <w:pStyle w:val="ListParagraph"/>
+        <w:numPr>
+          <w:ilvl w:val="0"/>
+          <w:numId w:val="2"/>
+        </w:numPr>
+        <w:spacing w:after="60"/>
+      </w:pPr>
+      <w:r>
+        <w:t xml:space="preserve">Named-entity damage. In nli-229, the actor’s name וינס ווהן (Vince Vaughn) had its initial ו stripped as the conjunction "and", yielding ו ינס ווהן — segmenters cannot distinguish a name-initial vav from a clitic.</w:t>
+      </w:r>
+    </w:p>
+    <w:p>
+      <w:pPr>
+        <w:pStyle w:val="ListParagraph"/>
+        <w:numPr>
+          <w:ilvl w:val="0"/>
+          <w:numId w:val="2"/>
+        </w:numPr>
+        <w:spacing w:after="60"/>
+      </w:pPr>
+      <w:r>
+        <w:t xml:space="preserve">Harm without any error. In nli-138, every split is a genuine clitic boundary (ו ניגב, ה ספרים) and no meaning changed — yet the model still flipped from a correct entailment to neutral. This control case directly supports the distribution-shift interpretation of Section 6.2: even error-free segmentation degrades comprehension.</w:t>
       </w:r>
     </w:p>
     <w:p>
@@ -5742,7 +5812,7 @@
         <w:jc w:val="both"/>
       </w:pPr>
       <w:r>
-        <w:t xml:space="preserve">Taken together, the three analyses tell one coherent story. Thirty years of Hebrew NLP practice assumed models need morphological decomposition; instruction-tuned LLMs do not. Their subword tokenizers perform implicit segmentation, their training distribution is raw text, and both of our interventions — changing the input to match linguistic theory, or asking the model to think about morphology — move the input or the computation away from what the model knows, with null-to-strongly-negative results. The finding that the most capable Hebrew model (Claude) is the most harmed is consistent with this view: the better a model’s implicit Hebrew processing, the more an external intervention disrupts it.</w:t>
+        <w:t xml:space="preserve">Taken together, the analyses tell one coherent story. Thirty years of Hebrew NLP practice assumed models need morphological decomposition; instruction-tuned LLMs do not. Their subword tokenizers perform implicit segmentation, their training distribution is raw text, and both of our interventions — changing the input to match linguistic theory, or asking the model to think about morphology — move the input or the computation away from what the model knows, with null-to-negative results whose magnitude scales inversely with model capability. Even where accuracy survives, manipulated input exacts a hidden cost: Claude thought longer (Section 5.3) and every model consumed 12–20% more tokens on segmented input.</w:t>
       </w:r>
     </w:p>
     <w:p>
@@ -5751,7 +5821,16 @@
         <w:jc w:val="both"/>
       </w:pPr>
       <w:r>
-        <w:t xml:space="preserve">Limitations. (1) Each condition uses a single prompt formulation; prompt sensitivity is a confound we mitigated but did not eliminate via the pilot. (2) The winning instruction was selected using GPT-4o only, which we later showed matters — a per-model pilot might yield less harmful instructions. (3) YAP’s segmentation is imperfect (≈0.875 token F1 vs gold); some segmented-condition harm may reflect segmenter errors rather than segmentation per se, though the uniformity of the degradation argues against this being the main driver. (4) QA conclusions depend on span normalization; we report both scorings. (5) Single run per cell (deterministic decoding); McNemar tests address sampling of items, not decoding variance, which is zero at temperature 0 for the API models in expectation but not guaranteed.</w:t>
+        <w:t xml:space="preserve">We also emphasize the methodological arc: our two most dramatic initial findings — a 20-point QA collapse and Claude’s apparent morphology fragility — were both largely evaluation artifacts, detected through qualitative inspection of per-example outputs and corrected via re-scoring and re-running. The corrected effects are smaller but far more trustworthy, and both artifact mechanisms (span-form mismatch; thinking-budget starvation) are reusable warnings for anyone evaluating LLMs on preprocessed input.</w:t>
+      </w:r>
+    </w:p>
+    <w:p>
+      <w:pPr>
+        <w:spacing w:after="120"/>
+        <w:jc w:val="both"/>
+      </w:pPr>
+      <w:r>
+        <w:t xml:space="preserve">Limitations. (1) Each condition uses a single prompt formulation; prompt sensitivity is mitigated by the pilot but not eliminated. (2) The winning instruction was selected using GPT-4o only, which we later showed matters — per-model pilots might yield less harmful instructions. (3) YAP’s segmentation is imperfect (≈0.875 token F1 vs gold); some segmented-condition harm may reflect segmenter errors rather than segmentation per se, though the uniformity of the degradation argues against this as the main driver. (4) QA conclusions depend on span normalization; we report both scorings. (5) Single run per cell with deterministic decoding; McNemar tests address item sampling, not decoding variance. (6) Claude was evaluated with extended thinking disabled; results may differ under other reasoning configurations.</w:t>
       </w:r>
     </w:p>
     <w:p>
@@ -5769,7 +5848,7 @@
         <w:jc w:val="both"/>
       </w:pPr>
       <w:r>
-        <w:t xml:space="preserve">We asked whether morphological decomposition still helps LLMs understand Hebrew. Across four models, three tasks, three input conditions and ~22,600 predictions, the answer is no: raw Hebrew is the best input everywhere, explicit YAP segmentation causes significant degradation (universally on NLI), and a novel prompt-guided morphology condition provides no benefit and can severely harm some models. Mechanistically, subword tokenizers already impose fine-grained segmentation on Hebrew, making explicit morphology redundant, distribution-shifting, and more expensive. For practitioners, the recommendation is simple: feed LLMs raw Hebrew. For the field, the result marks a genuine paradigm shift — preprocessing wisdom from the statistical-NLP era does not transfer to instruction-tuned LLMs, and “helping” them with linguistic structure can actively hurt.</w:t>
+        <w:t xml:space="preserve">We asked whether morphological decomposition still helps LLMs understand Hebrew. Across four models, three tasks, three input conditions and ~22,600 predictions, the answer is no: raw Hebrew is the best input everywhere. Explicit YAP segmentation yields significant but modest degradation for frontier models and larger harm for small ones; a novel prompt-guided morphology condition provides no benefit and is significantly harmful precisely for the small models it was hypothesized to help most. Mechanistically, subword tokenizers already impose fine-grained segmentation on Hebrew, making explicit morphology redundant, distribution-shifting, and 12–20% more expensive. For practitioners, the recommendation is simple: feed LLMs raw Hebrew. For the field, the result marks a genuine paradigm shift — preprocessing wisdom from the statistical-NLP era does not transfer to instruction-tuned LLMs, and “helping” them with linguistic structure can actively hurt, subtly distort evaluation, and measurably increase reasoning effort.</w:t>
       </w:r>
     </w:p>
     <w:p>

</xml_diff>

<commit_message>
Issues #15-16: slides deck, report v3 + PDF, rewritten README, verified annotations, corrected video brief
Co-Authored-By: Claude Opus 4.6 (1M context) <noreply@anthropic.com>
</commit_message>
<xml_diff>
--- a/report/report_draft.docx
+++ b/report/report_draft.docx
@@ -79,7 +79,7 @@
         <w:jc w:val="both"/>
       </w:pPr>
       <w:r>
-        <w:t xml:space="preserve">Modern large language models challenge this convention. They consume text through subword tokenizers (BPE and variants) trained on raw, unsegmented corpora, and they appear to handle Hebrew reasonably well without any explicit morphological preprocessing. This project revisits the classic question in the LLM era:</w:t>
+        <w:t xml:space="preserve">Modern large language models challenge this convention. They consume text through subword tokenizers (BPE and variants) trained on raw, unsegmented corpora, and they appear to handle Hebrew reasonably well without explicit morphological preprocessing. This project revisits the classic question in the LLM era:</w:t>
       </w:r>
     </w:p>
     <w:p>
@@ -114,7 +114,7 @@
         <w:jc w:val="both"/>
       </w:pPr>
       <w:r>
-        <w:t xml:space="preserve">We answer these questions with a systematic 4×3×3 experiment: four LLMs (GPT-4o, Claude, LLaMA 3.2 3B Instruct, Mistral 7B Instruct) evaluated on three Hebrew tasks (sentiment analysis, natural language inference, and extractive question answering) under three input conditions (raw text, YAP-segmented text, and prompt-guided morphology), totaling roughly 22,600 model predictions. Beyond aggregate metrics, we contribute a paired statistical analysis (McNemar tests), a flip analysis linking answer changes to morphological properties of the input, a tokenizer fertility analysis that explains the results mechanistically, and the identification of a subtle evaluation artifact that inflates the apparent harm of segmentation in extractive QA.</w:t>
+        <w:t xml:space="preserve">We answer these questions with a systematic 4×3×3 experiment: four LLMs (GPT-4o, Claude, LLaMA 3.2 3B Instruct, Mistral 7B Instruct) evaluated on three Hebrew tasks (sentiment analysis, natural language inference, and extractive question answering) under three input conditions (raw text, YAP-segmented text, and prompt-guided morphology), totaling roughly 22,600 model predictions. Beyond aggregate metrics, we contribute paired statistical analysis (exact McNemar tests), a flip analysis linking answer changes to morphological properties of the input, a tokenizer fertility analysis that explains the results mechanistically, and — a methodological contribution in its own right — the identification and correction of two evaluation artifacts that initially exaggerated the harm of segmentation: a span-spacing artifact in extractive QA, and a thinking-budget artifact in which a reasoning model returned empty answers on unfamiliar input.</w:t>
       </w:r>
     </w:p>
     <w:p>
@@ -130,7 +130,7 @@
         <w:t xml:space="preserve">Our answer to RQ1 is no: </w:t>
       </w:r>
       <w:r>
-        <w:t xml:space="preserve">raw Hebrew is the best input condition for every model on nearly every task, and segmentation causes statistically significant degradation on NLI for all four models. Our answer to RQ2 is that there is no benefit to substitute: the morphology instruction is null-to-harmful, and its effect is strongly model-dependent.</w:t>
+        <w:t xml:space="preserve">raw Hebrew is the best input condition for every model on nearly every task. Segmentation never helps significantly; it significantly degrades NLI for three of four models (all four directionally) and QA for all four. Our answer to RQ2 is that there is no benefit to substitute: the morphology instruction is null for frontier models and significantly harmful for the small models — prompt-based linguistic scaffolding does not transfer.</w:t>
       </w:r>
     </w:p>
     <w:p>
@@ -229,7 +229,7 @@
           <w:ilvl w:val="0"/>
           <w:numId w:val="2"/>
         </w:numPr>
-        <w:spacing w:after="120"/>
+        <w:spacing w:after="60"/>
       </w:pPr>
       <w:r>
         <w:t xml:space="preserve">QA — Etelis/HeQ_v1: SQuAD-style reading comprehension over Hebrew Wikipedia and Geektime. We use 500 answerable test questions, sampled uniformly.</w:t>
@@ -295,7 +295,7 @@
           <w:ilvl w:val="0"/>
           <w:numId w:val="2"/>
         </w:numPr>
-        <w:spacing w:after="120"/>
+        <w:spacing w:after="60"/>
       </w:pPr>
       <w:r>
         <w:t xml:space="preserve">prompt_guided (novel) — raw text plus a natural-language instruction telling the model that Hebrew words bundle clitic prefixes and suffixes and asking it to mentally decompose each word before answering.</w:t>
@@ -1117,7 +1117,7 @@
         <w:jc w:val="both"/>
       </w:pPr>
       <w:r>
-        <w:t xml:space="preserve">GPT-4o (OpenAI API) and Claude (Anthropic API) represent frontier commercial models; LLaMA 3.2 3B Instruct and Mistral 7B Instruct (HuggingFace weights, run on a Colab T4 GPU in fp16) represent small open models. All models are evaluated zero-shot with frozen weights and deterministic (greedy / temperature-0) decoding — no fine-tuning — so differences between conditions stem purely from input presentation. Instructions are in English with Hebrew text embedded; answers are constrained to a single English label (classification) or a copied Hebrew span (QA) and parsed strictly, with ambiguous outputs counted as errors. Parse-failure rates were ≤1.2% in every one of the 36 model×task×condition cells.</w:t>
+        <w:t xml:space="preserve">GPT-4o (OpenAI API) and Claude (Anthropic API) represent frontier commercial models; LLaMA 3.2 3B Instruct and Mistral 7B Instruct (HuggingFace weights, run on a Colab T4 GPU in fp16) represent small open models. All models are evaluated zero-shot with frozen weights and deterministic (greedy / temperature-0) decoding — no fine-tuning — so differences between conditions stem purely from input presentation. For Claude, a reasoning-capable model, extended thinking is explicitly disabled (Section 5.3 documents why). Instructions are in English with Hebrew text embedded; answers are constrained to a single English label (classification) or a copied Hebrew span (QA) and parsed strictly, with ambiguous outputs counted as errors. Parse-failure rates are ≤1.2% in every one of the 36 model×task×condition cells.</w:t>
       </w:r>
     </w:p>
     <w:p>
@@ -1135,7 +1135,7 @@
         <w:jc w:val="both"/>
       </w:pPr>
       <w:r>
-        <w:t xml:space="preserve">Every prediction is stored as a JSONL record containing the exact prompt, raw model output, parsed label, and gold answer. All API calls pass through a SQLite response cache keyed by prompt hash; runs are resumable by example id (crash-safe append-and-flush), which allowed the GPU sweeps to survive Colab preemptions without losing or duplicating work. One pathological 2,276-token comment exceeded T4 memory with Mistral and was truncated head+tail to 2,048 tokens (documented; single example). Total commercial API spend for all experiments was under $40. [TODO: replace with exact spend from billing dashboards]</w:t>
+        <w:t xml:space="preserve">Every prediction is stored as a JSONL record containing the exact prompt, raw model output, parsed label, and gold answer. All API calls pass through a SQLite response cache keyed by prompt hash; runs are resumable by example id (crash-safe append-and-flush), which allowed the GPU sweeps to survive Colab preemptions without losing or duplicating work. An automated audit validates all 36 result files for duplicates, empty outputs, degenerate predictions, prompt-condition integrity, and cross-condition id/gold consistency. One pathological 2,276-token comment exceeded T4 memory with Mistral and was truncated head+tail to 2,048 tokens (documented; single example). Total commercial API spend for all experiments — including the pilot, all three conditions, and the artifact-correction re-runs — was $10.65 ($7.30 Anthropic, $3.35 OpenAI).</w:t>
       </w:r>
     </w:p>
     <w:p>
@@ -1153,7 +1153,7 @@
         <w:jc w:val="both"/>
       </w:pPr>
       <w:r>
-        <w:t xml:space="preserve">Tables 2–4 present the primary metric per task (accuracy for classification, exact match for QA) under all three conditions, with deltas versus raw and exact two-sided McNemar p-values on the paired predictions. Bold p-values are significant at α=0.05.</w:t>
+        <w:t xml:space="preserve">Tables 2–4 present the primary metric per task (accuracy for classification, exact match for QA) under all three conditions, with deltas versus raw and exact two-sided McNemar p-values on the paired predictions. Bold/starred p-values are significant at α=0.05.</w:t>
       </w:r>
     </w:p>
     <w:p>
@@ -1676,7 +1676,7 @@
                 <w:sz w:val="18"/>
                 <w:szCs w:val="18"/>
               </w:rPr>
-              <w:t xml:space="preserve">0.814</w:t>
+              <w:t xml:space="preserve">0.824</w:t>
             </w:r>
           </w:p>
         </w:tc>
@@ -1701,7 +1701,7 @@
                 <w:sz w:val="18"/>
                 <w:szCs w:val="18"/>
               </w:rPr>
-              <w:t xml:space="preserve">−0.008</w:t>
+              <w:t xml:space="preserve">+0.002</w:t>
             </w:r>
           </w:p>
         </w:tc>
@@ -1726,7 +1726,7 @@
                 <w:sz w:val="18"/>
                 <w:szCs w:val="18"/>
               </w:rPr>
-              <w:t xml:space="preserve">0.557</w:t>
+              <w:t xml:space="preserve">1.000</w:t>
             </w:r>
           </w:p>
         </w:tc>
@@ -1751,7 +1751,7 @@
                 <w:sz w:val="18"/>
                 <w:szCs w:val="18"/>
               </w:rPr>
-              <w:t xml:space="preserve">0.752</w:t>
+              <w:t xml:space="preserve">0.820</w:t>
             </w:r>
           </w:p>
         </w:tc>
@@ -1776,7 +1776,7 @@
                 <w:sz w:val="18"/>
                 <w:szCs w:val="18"/>
               </w:rPr>
-              <w:t xml:space="preserve">−0.070</w:t>
+              <w:t xml:space="preserve">−0.002</w:t>
             </w:r>
           </w:p>
         </w:tc>
@@ -1801,7 +1801,7 @@
                 <w:sz w:val="18"/>
                 <w:szCs w:val="18"/>
               </w:rPr>
-              <w:t xml:space="preserve">&lt;0.0001</w:t>
+              <w:t xml:space="preserve">1.000</w:t>
             </w:r>
           </w:p>
         </w:tc>
@@ -2609,7 +2609,7 @@
                 <w:sz w:val="18"/>
                 <w:szCs w:val="18"/>
               </w:rPr>
-              <w:t xml:space="preserve">0.860</w:t>
+              <w:t xml:space="preserve">0.857</w:t>
             </w:r>
           </w:p>
         </w:tc>
@@ -2634,7 +2634,7 @@
                 <w:sz w:val="18"/>
                 <w:szCs w:val="18"/>
               </w:rPr>
-              <w:t xml:space="preserve">−0.025</w:t>
+              <w:t xml:space="preserve">−0.027</w:t>
             </w:r>
           </w:p>
         </w:tc>
@@ -2711,7 +2711,7 @@
                 <w:sz w:val="18"/>
                 <w:szCs w:val="18"/>
               </w:rPr>
-              <w:t xml:space="preserve">0.876</w:t>
+              <w:t xml:space="preserve">0.914</w:t>
             </w:r>
           </w:p>
         </w:tc>
@@ -2736,7 +2736,7 @@
                 <w:sz w:val="18"/>
                 <w:szCs w:val="18"/>
               </w:rPr>
-              <w:t xml:space="preserve">0.688</w:t>
+              <w:t xml:space="preserve">0.891</w:t>
             </w:r>
           </w:p>
         </w:tc>
@@ -2761,7 +2761,7 @@
                 <w:sz w:val="18"/>
                 <w:szCs w:val="18"/>
               </w:rPr>
-              <w:t xml:space="preserve">−0.188</w:t>
+              <w:t xml:space="preserve">−0.023</w:t>
             </w:r>
           </w:p>
         </w:tc>
@@ -2786,7 +2786,7 @@
                 <w:sz w:val="18"/>
                 <w:szCs w:val="18"/>
               </w:rPr>
-              <w:t xml:space="preserve">&lt;0.0001</w:t>
+              <w:t xml:space="preserve">0.0169</w:t>
             </w:r>
           </w:p>
         </w:tc>
@@ -2811,7 +2811,7 @@
                 <w:sz w:val="18"/>
                 <w:szCs w:val="18"/>
               </w:rPr>
-              <w:t xml:space="preserve">0.641</w:t>
+              <w:t xml:space="preserve">0.900</w:t>
             </w:r>
           </w:p>
         </w:tc>
@@ -2836,7 +2836,7 @@
                 <w:sz w:val="18"/>
                 <w:szCs w:val="18"/>
               </w:rPr>
-              <w:t xml:space="preserve">−0.235</w:t>
+              <w:t xml:space="preserve">−0.014</w:t>
             </w:r>
           </w:p>
         </w:tc>
@@ -2861,7 +2861,7 @@
                 <w:sz w:val="18"/>
                 <w:szCs w:val="18"/>
               </w:rPr>
-              <w:t xml:space="preserve">&lt;0.0001</w:t>
+              <w:t xml:space="preserve">0.155</w:t>
             </w:r>
           </w:p>
         </w:tc>
@@ -3669,7 +3669,7 @@
                 <w:sz w:val="18"/>
                 <w:szCs w:val="18"/>
               </w:rPr>
-              <w:t xml:space="preserve">0.653</w:t>
+              <w:t xml:space="preserve">0.648</w:t>
             </w:r>
           </w:p>
         </w:tc>
@@ -3694,7 +3694,7 @@
                 <w:sz w:val="18"/>
                 <w:szCs w:val="18"/>
               </w:rPr>
-              <w:t xml:space="preserve">+0.025</w:t>
+              <w:t xml:space="preserve">+0.020</w:t>
             </w:r>
           </w:p>
         </w:tc>
@@ -3771,7 +3771,7 @@
                 <w:sz w:val="18"/>
                 <w:szCs w:val="18"/>
               </w:rPr>
-              <w:t xml:space="preserve">0.652</w:t>
+              <w:t xml:space="preserve">0.700</w:t>
             </w:r>
           </w:p>
         </w:tc>
@@ -3796,7 +3796,7 @@
                 <w:sz w:val="18"/>
                 <w:szCs w:val="18"/>
               </w:rPr>
-              <w:t xml:space="preserve">0.432</w:t>
+              <w:t xml:space="preserve">0.478</w:t>
             </w:r>
           </w:p>
         </w:tc>
@@ -3821,7 +3821,7 @@
                 <w:sz w:val="18"/>
                 <w:szCs w:val="18"/>
               </w:rPr>
-              <w:t xml:space="preserve">−0.220</w:t>
+              <w:t xml:space="preserve">−0.222</w:t>
             </w:r>
           </w:p>
         </w:tc>
@@ -3871,7 +3871,7 @@
                 <w:sz w:val="18"/>
                 <w:szCs w:val="18"/>
               </w:rPr>
-              <w:t xml:space="preserve">0.611</w:t>
+              <w:t xml:space="preserve">0.682</w:t>
             </w:r>
           </w:p>
         </w:tc>
@@ -3896,7 +3896,7 @@
                 <w:sz w:val="18"/>
                 <w:szCs w:val="18"/>
               </w:rPr>
-              <w:t xml:space="preserve">−0.041</w:t>
+              <w:t xml:space="preserve">−0.018</w:t>
             </w:r>
           </w:p>
         </w:tc>
@@ -3921,7 +3921,7 @@
                 <w:sz w:val="18"/>
                 <w:szCs w:val="18"/>
               </w:rPr>
-              <w:t xml:space="preserve">0.0066</w:t>
+              <w:t xml:space="preserve">0.243</w:t>
             </w:r>
           </w:p>
         </w:tc>
@@ -4355,7 +4355,7 @@
         <w:spacing w:after="60"/>
       </w:pPr>
       <w:r>
-        <w:t xml:space="preserve">Raw Hebrew wins. No model on any task is significantly improved by either intervention. On NLI, segmentation significantly degrades all four models; prompt-guided morphology significantly degrades all four models on at least one task.</w:t>
+        <w:t xml:space="preserve">Raw Hebrew wins. No model is significantly improved by either intervention on any task. Segmentation significantly degrades NLI for three of four models (all four directionally) and QA for all four; sentiment is unaffected for all models.</w:t>
       </w:r>
     </w:p>
     <w:p>
@@ -4368,7 +4368,7 @@
         <w:spacing w:after="60"/>
       </w:pPr>
       <w:r>
-        <w:t xml:space="preserve">Claude is the most morphology-sensitive model. Segmentation costs it 18.8 points on NLI and the morphology instruction costs it 23.5 points on NLI and 7.0 on sentiment (all p&lt;0.0001) — the strongest Hebrew performer is the one most damaged by imposed morphological structure.</w:t>
+        <w:t xml:space="preserve">Effect sizes scale inversely with model strength. For the frontier models the real NLI cost of segmentation is modest (GPT-4o −3.8, Claude −2.3 points); for the small models the prompt-guided instruction is the most harmful condition (LLaMA: −8.3 NLI, −11.4 QA, both p&lt;0.0001).</w:t>
       </w:r>
     </w:p>
     <w:p>
@@ -4381,7 +4381,7 @@
         <w:spacing w:after="60"/>
       </w:pPr>
       <w:r>
-        <w:t xml:space="preserve">The novel condition is null-to-harmful. For GPT-4o, prompt-guided morphology is statistically indistinguishable from raw on sentiment and QA; for Claude and LLaMA it is actively harmful. The instruction was selected in a GPT-4o pilot and does not transfer to other models — prompt-based linguistic scaffolding is model-dependent.</w:t>
+        <w:t xml:space="preserve">The novel condition is null for frontier models and harmful for small ones. GPT-4o and Claude are statistically unaffected by the morphology instruction on sentiment and QA (Claude also on NLI); LLaMA is significantly harmed on NLI and QA. The instruction was selected in a GPT-4o pilot and does not transfer downward — prompt-based linguistic scaffolding is model-dependent.</w:t>
       </w:r>
     </w:p>
     <w:p>
@@ -4391,10 +4391,10 @@
           <w:ilvl w:val="0"/>
           <w:numId w:val="2"/>
         </w:numPr>
-        <w:spacing w:after="120"/>
-      </w:pPr>
-      <w:r>
-        <w:t xml:space="preserve">The only (non-significant) positive signal: small-model sentiment. LLaMA gains +1.4 (segmented) and +2.2 (prompt-guided) points on sentiment with net-positive flips — a direction worth noting but not statistical evidence.</w:t>
+        <w:spacing w:after="60"/>
+      </w:pPr>
+      <w:r>
+        <w:t xml:space="preserve">The only (non-significant) positive signal: small-model sentiment. LLaMA gains +1.4 (segmented) and +2.2 (prompt-guided) points on sentiment with net-positive flips — a consistent direction worth noting, but not statistical evidence.</w:t>
       </w:r>
     </w:p>
     <w:p>
@@ -4403,7 +4403,7 @@
         <w:spacing w:after="100" w:before="220"/>
       </w:pPr>
       <w:r>
-        <w:t xml:space="preserve">5.2 The QA spacing artifact</w:t>
+        <w:t xml:space="preserve">5.2 Evaluation artifact I: QA span spacing</w:t>
       </w:r>
     </w:p>
     <w:p>
@@ -4412,7 +4412,7 @@
         <w:jc w:val="both"/>
       </w:pPr>
       <w:r>
-        <w:t xml:space="preserve">A large part of the apparent QA collapse under segmentation is an evaluation artifact, not comprehension loss. In the segmented condition, models copy answer spans from segmented context (e.g., ב ירושלים), which fail exact-match against raw-form gold answers (בירושלים). Rescoring with space-insensitive exact match, GPT-4o’s segmented EM rises from 0.424 to 0.600 (vs raw 0.628) and Claude’s from 0.432 to 0.592 (vs 0.652): roughly 80% of the apparent drop is spacing. The artifact-corrected picture is a modest real degradation of 3–6 points. LLaMA shows almost no such gap (0.280→0.292), indicating it was not faithfully copying segmented spans in the first place.</w:t>
+        <w:t xml:space="preserve">A large part of the apparent QA collapse under segmentation is an evaluation artifact, not comprehension loss. In the segmented condition, models copy answer spans from segmented context (e.g., ב ירושלים), which fail exact-match against raw-form gold answers (בירושלים). Rescoring with space-insensitive exact match, GPT-4o’s segmented EM rises from 0.424 to 0.600 (vs raw 0.628) and Claude’s from 0.478 to 0.654 (vs 0.700): most of the apparent 20-point drop is spacing, and the artifact-corrected real degradation is 3–5 points. LLaMA shows almost no such gap (0.280→0.292), indicating it was not faithfully copying segmented spans in the first place.</w:t>
       </w:r>
     </w:p>
     <w:p>
@@ -4702,7 +4702,7 @@
                 <w:sz w:val="18"/>
                 <w:szCs w:val="18"/>
               </w:rPr>
-              <w:t xml:space="preserve">0.652</w:t>
+              <w:t xml:space="preserve">0.700</w:t>
             </w:r>
           </w:p>
         </w:tc>
@@ -4727,7 +4727,7 @@
                 <w:sz w:val="18"/>
                 <w:szCs w:val="18"/>
               </w:rPr>
-              <w:t xml:space="preserve">0.432</w:t>
+              <w:t xml:space="preserve">0.478</w:t>
             </w:r>
           </w:p>
         </w:tc>
@@ -4752,7 +4752,7 @@
                 <w:sz w:val="18"/>
                 <w:szCs w:val="18"/>
               </w:rPr>
-              <w:t xml:space="preserve">0.592</w:t>
+              <w:t xml:space="preserve">0.654</w:t>
             </w:r>
           </w:p>
         </w:tc>
@@ -4969,6 +4969,24 @@
     </w:p>
     <w:p>
       <w:pPr>
+        <w:pStyle w:val="Heading2"/>
+        <w:spacing w:after="100" w:before="220"/>
+      </w:pPr>
+      <w:r>
+        <w:t xml:space="preserve">5.3 Evaluation artifact II: thinking-budget starvation</w:t>
+      </w:r>
+    </w:p>
+    <w:p>
+      <w:pPr>
+        <w:spacing w:after="120"/>
+        <w:jc w:val="both"/>
+      </w:pPr>
+      <w:r>
+        <w:t xml:space="preserve">Our first full run produced a dramatic headline — Claude losing 18.8 NLI points under segmentation — that turned out to be almost entirely an artifact. Claude is a reasoning model that emits internal “thinking” tokens before its visible answer; under our tight answer budgets (8 tokens for classification), thinking could consume the entire budget and yield an empty response, which our strict scorer counted as an error. Crucially, this happened far more often on manipulated input: on NLI, 5.3% of raw inputs produced empty responses versus 26.2% of segmented inputs (QA: 18.0% vs 27.2%). After disabling extended thinking and re-running the affected examples, Claude’s segmented NLI “collapse” shrank from −18.8 to −2.3 points. We draw two lessons. Methodologically: when evaluating reasoning models with constrained output budgets, empty responses must be detected and handled, or they silently masquerade as task errors. Scientifically: the empty-response rate is itself a signal — morphologically manipulated input made the model think measurably longer, i.e., increased processing effort even where final accuracy was ultimately unaffected.</w:t>
+      </w:r>
+    </w:p>
+    <w:p>
+      <w:pPr>
         <w:pStyle w:val="Heading1"/>
         <w:spacing w:after="140" w:before="280"/>
       </w:pPr>
@@ -4991,7 +5009,7 @@
         <w:jc w:val="both"/>
       </w:pPr>
       <w:r>
-        <w:t xml:space="preserve">For each model×task we identify examples whose correctness flipped between raw and each condition. Flips are overwhelmingly harmful: pooled across models, the segmented condition produces 454 harmful vs 185 helpful flips on NLI and 385 vs 98 on QA. The most extreme case is Claude×NLI: 176 harmful vs 10 helpful flips under segmentation, and 238 vs 7 under the morphology instruction.</w:t>
+        <w:t xml:space="preserve">For each model×task we identify examples whose correctness flipped between raw and each condition. Flips are predominantly harmful: pooled across models, the segmented condition produces 320 harmful vs 197 helpful flips on NLI and 392 vs 104 on QA. For Claude on NLI the corrected ratio is 42 harmful vs 22 helpful under segmentation — a real but moderate asymmetry, in sharp contrast to the artifact-inflated pre-correction figures.</w:t>
       </w:r>
     </w:p>
     <w:p>
@@ -5009,7 +5027,7 @@
         <w:jc w:val="both"/>
       </w:pPr>
       <w:r>
-        <w:t xml:space="preserve">We computed morphological features of every example from its YAP output (expansion ratio; clitic-prefix density). On sentiment, harm concentrates in heavily-segmented examples: harmful flips average expansion 1.69 vs 1.51 for stable examples, while helpful flips average 1.43. On NLI and QA, however, flipped and stable examples are morphologically indistinguishable (e.g., NLI: 1.59 vs 1.59). The degradation there is therefore not concentrated where morphology is complex — it behaves like a uniform distribution shift: models simply read Hebrew worse when its spacing no longer matches the distribution they were trained on.</w:t>
+        <w:t xml:space="preserve">We computed morphological features of every example from its YAP output (expansion ratio; clitic-prefix density). On sentiment, harm concentrates in heavily-segmented examples: harmful flips average expansion 1.70 vs 1.51 for stable examples, while helpful flips average 1.43. On NLI and QA, however, flipped and stable examples are morphologically indistinguishable (e.g., NLI: 1.60 vs 1.59). The degradation there is therefore not concentrated where morphology is complex — it behaves like a uniform distribution shift: models simply read Hebrew worse when its spacing no longer matches the distribution they were trained on.</w:t>
       </w:r>
     </w:p>
     <w:p>
@@ -5027,7 +5045,59 @@
         <w:jc w:val="both"/>
       </w:pPr>
       <w:r>
-        <w:t xml:space="preserve">[TODO: 2–3 annotated examples from analysis/flip_examples.md — pick harmful Claude NLI flips and explain in one sentence each what the segmented rendering changed. Native-speaker annotation needed.]</w:t>
+        <w:t xml:space="preserve">Native-speaker inspection of harmful Claude×NLI flips (annotated in analysis/flip_annotations.md) reveals a four-way taxonomy of how segmentation causes errors:</w:t>
+      </w:r>
+    </w:p>
+    <w:p>
+      <w:pPr>
+        <w:pStyle w:val="ListParagraph"/>
+        <w:numPr>
+          <w:ilvl w:val="0"/>
+          <w:numId w:val="2"/>
+        </w:numPr>
+        <w:spacing w:after="60"/>
+      </w:pPr>
+      <w:r>
+        <w:t xml:space="preserve">Meaning-changing normalization. In nli-163, YAP rendered לעולם ("ever", idiomatic under negation: "one must never ignore reality") as ל ה עולם — literally "to the world" — erasing the temporal idiom. The model answered a hypothesis that no longer says what its author wrote.</w:t>
+      </w:r>
+    </w:p>
+    <w:p>
+      <w:pPr>
+        <w:pStyle w:val="ListParagraph"/>
+        <w:numPr>
+          <w:ilvl w:val="0"/>
+          <w:numId w:val="2"/>
+        </w:numPr>
+        <w:spacing w:after="60"/>
+      </w:pPr>
+      <w:r>
+        <w:t xml:space="preserve">Segmenter error destroying a content word. In nli-178, מקורם ("their origin", stem מקור + possessive ם) was mis-split as מ קורם, treating the initial מ as the preposition "from" and leaving a non-word — the concept carrying the entire question vanished.</w:t>
+      </w:r>
+    </w:p>
+    <w:p>
+      <w:pPr>
+        <w:pStyle w:val="ListParagraph"/>
+        <w:numPr>
+          <w:ilvl w:val="0"/>
+          <w:numId w:val="2"/>
+        </w:numPr>
+        <w:spacing w:after="60"/>
+      </w:pPr>
+      <w:r>
+        <w:t xml:space="preserve">Named-entity damage. In nli-229, the actor’s name וינס ווהן (Vince Vaughn) had its initial ו stripped as the conjunction "and", yielding ו ינס ווהן — segmenters cannot distinguish a name-initial vav from a clitic.</w:t>
+      </w:r>
+    </w:p>
+    <w:p>
+      <w:pPr>
+        <w:pStyle w:val="ListParagraph"/>
+        <w:numPr>
+          <w:ilvl w:val="0"/>
+          <w:numId w:val="2"/>
+        </w:numPr>
+        <w:spacing w:after="60"/>
+      </w:pPr>
+      <w:r>
+        <w:t xml:space="preserve">Harm without any error. In nli-138, every split is a genuine clitic boundary (ו ניגב, ה ספרים) and no meaning changed — yet the model still flipped from a correct entailment to neutral. This control case directly supports the distribution-shift interpretation of Section 6.2: even error-free segmentation degrades comprehension.</w:t>
       </w:r>
     </w:p>
     <w:p>
@@ -5742,7 +5812,7 @@
         <w:jc w:val="both"/>
       </w:pPr>
       <w:r>
-        <w:t xml:space="preserve">Taken together, the three analyses tell one coherent story. Thirty years of Hebrew NLP practice assumed models need morphological decomposition; instruction-tuned LLMs do not. Their subword tokenizers perform implicit segmentation, their training distribution is raw text, and both of our interventions — changing the input to match linguistic theory, or asking the model to think about morphology — move the input or the computation away from what the model knows, with null-to-strongly-negative results. The finding that the most capable Hebrew model (Claude) is the most harmed is consistent with this view: the better a model’s implicit Hebrew processing, the more an external intervention disrupts it.</w:t>
+        <w:t xml:space="preserve">Taken together, the analyses tell one coherent story. Thirty years of Hebrew NLP practice assumed models need morphological decomposition; instruction-tuned LLMs do not. Their subword tokenizers perform implicit segmentation, their training distribution is raw text, and both of our interventions — changing the input to match linguistic theory, or asking the model to think about morphology — move the input or the computation away from what the model knows, with null-to-negative results whose magnitude scales inversely with model capability. Even where accuracy survives, manipulated input exacts a hidden cost: Claude thought longer (Section 5.3) and every model consumed 12–20% more tokens on segmented input.</w:t>
       </w:r>
     </w:p>
     <w:p>
@@ -5751,7 +5821,16 @@
         <w:jc w:val="both"/>
       </w:pPr>
       <w:r>
-        <w:t xml:space="preserve">Limitations. (1) Each condition uses a single prompt formulation; prompt sensitivity is a confound we mitigated but did not eliminate via the pilot. (2) The winning instruction was selected using GPT-4o only, which we later showed matters — a per-model pilot might yield less harmful instructions. (3) YAP’s segmentation is imperfect (≈0.875 token F1 vs gold); some segmented-condition harm may reflect segmenter errors rather than segmentation per se, though the uniformity of the degradation argues against this being the main driver. (4) QA conclusions depend on span normalization; we report both scorings. (5) Single run per cell (deterministic decoding); McNemar tests address sampling of items, not decoding variance, which is zero at temperature 0 for the API models in expectation but not guaranteed.</w:t>
+        <w:t xml:space="preserve">We also emphasize the methodological arc: our two most dramatic initial findings — a 20-point QA collapse and Claude’s apparent morphology fragility — were both largely evaluation artifacts, detected through qualitative inspection of per-example outputs and corrected via re-scoring and re-running. The corrected effects are smaller but far more trustworthy, and both artifact mechanisms (span-form mismatch; thinking-budget starvation) are reusable warnings for anyone evaluating LLMs on preprocessed input.</w:t>
+      </w:r>
+    </w:p>
+    <w:p>
+      <w:pPr>
+        <w:spacing w:after="120"/>
+        <w:jc w:val="both"/>
+      </w:pPr>
+      <w:r>
+        <w:t xml:space="preserve">Limitations. (1) Each condition uses a single prompt formulation; prompt sensitivity is mitigated by the pilot but not eliminated. (2) The winning instruction was selected using GPT-4o only, which we later showed matters — per-model pilots might yield less harmful instructions. (3) YAP’s segmentation is imperfect (≈0.875 token F1 vs gold); some segmented-condition harm may reflect segmenter errors rather than segmentation per se, though the uniformity of the degradation argues against this as the main driver. (4) QA conclusions depend on span normalization; we report both scorings. (5) Single run per cell with deterministic decoding; McNemar tests address item sampling, not decoding variance. (6) Claude was evaluated with extended thinking disabled; results may differ under other reasoning configurations.</w:t>
       </w:r>
     </w:p>
     <w:p>
@@ -5769,7 +5848,7 @@
         <w:jc w:val="both"/>
       </w:pPr>
       <w:r>
-        <w:t xml:space="preserve">We asked whether morphological decomposition still helps LLMs understand Hebrew. Across four models, three tasks, three input conditions and ~22,600 predictions, the answer is no: raw Hebrew is the best input everywhere, explicit YAP segmentation causes significant degradation (universally on NLI), and a novel prompt-guided morphology condition provides no benefit and can severely harm some models. Mechanistically, subword tokenizers already impose fine-grained segmentation on Hebrew, making explicit morphology redundant, distribution-shifting, and more expensive. For practitioners, the recommendation is simple: feed LLMs raw Hebrew. For the field, the result marks a genuine paradigm shift — preprocessing wisdom from the statistical-NLP era does not transfer to instruction-tuned LLMs, and “helping” them with linguistic structure can actively hurt.</w:t>
+        <w:t xml:space="preserve">We asked whether morphological decomposition still helps LLMs understand Hebrew. Across four models, three tasks, three input conditions and ~22,600 predictions, the answer is no: raw Hebrew is the best input everywhere. Explicit YAP segmentation yields significant but modest degradation for frontier models and larger harm for small ones; a novel prompt-guided morphology condition provides no benefit and is significantly harmful precisely for the small models it was hypothesized to help most. Mechanistically, subword tokenizers already impose fine-grained segmentation on Hebrew, making explicit morphology redundant, distribution-shifting, and 12–20% more expensive. For practitioners, the recommendation is simple: feed LLMs raw Hebrew. For the field, the result marks a genuine paradigm shift — preprocessing wisdom from the statistical-NLP era does not transfer to instruction-tuned LLMs, and “helping” them with linguistic structure can actively hurt, subtly distort evaluation, and measurably increase reasoning effort.</w:t>
       </w:r>
     </w:p>
     <w:p>
@@ -5779,15 +5858,6 @@
       </w:pPr>
       <w:r>
         <w:t xml:space="preserve">References</w:t>
-      </w:r>
-    </w:p>
-    <w:p>
-      <w:pPr>
-        <w:spacing w:after="120"/>
-        <w:jc w:val="both"/>
-      </w:pPr>
-      <w:r>
-        <w:t xml:space="preserve">[TODO: verify/complete citations]</w:t>
       </w:r>
     </w:p>
     <w:p>
@@ -5800,7 +5870,7 @@
         <w:spacing w:after="60"/>
       </w:pPr>
       <w:r>
-        <w:t xml:space="preserve">More, A. and Tsarfaty, R. (2016). Data-Driven Morphological Analysis and Disambiguation for Morphologically Rich Languages and Universal Dependencies. COLING.</w:t>
+        <w:t xml:space="preserve">More, A. and Tsarfaty, R. (2016). Data-Driven Morphological Analysis and Disambiguation for Morphologically Rich Languages and Universal Dependencies. Proceedings of COLING 2016.</w:t>
       </w:r>
     </w:p>
     <w:p>
@@ -5813,7 +5883,7 @@
         <w:spacing w:after="60"/>
       </w:pPr>
       <w:r>
-        <w:t xml:space="preserve">Seker, A. et al. (2021). AlephBERT: Language Model Pre-training and Evaluation from Sub-Word to Sentence Level. ACL.</w:t>
+        <w:t xml:space="preserve">Seker, A., Bandel, E., Bareket, D., Brusilovsky, I., Greenfeld, R., and Tsarfaty, R. (2022). AlephBERT: Language Model Pre-training and Evaluation from Sub-Word to Sentence Level. Proceedings of ACL 2022, pp. 46–56.</w:t>
       </w:r>
     </w:p>
     <w:p>
@@ -5826,7 +5896,7 @@
         <w:spacing w:after="60"/>
       </w:pPr>
       <w:r>
-        <w:t xml:space="preserve">Shmidman, S. et al. (2023). DictaBERT: A State-of-the-Art BERT Suite for Modern Hebrew. arXiv.</w:t>
+        <w:t xml:space="preserve">Shmidman, S., Shmidman, A., and Koppel, M. (2023). DictaBERT: A State-of-the-Art BERT Suite for Modern Hebrew. arXiv:2308.16687.</w:t>
       </w:r>
     </w:p>
     <w:p>
@@ -5839,7 +5909,7 @@
         <w:spacing w:after="60"/>
       </w:pPr>
       <w:r>
-        <w:t xml:space="preserve">Amram, A. et al. (2018). Representations and Architectures in Neural Sentiment Analysis for Morphologically Rich Languages: A Case Study from Modern Hebrew. COLING. (hebrew_sentiment dataset)</w:t>
+        <w:t xml:space="preserve">Amram, A., Ben-David, A., and Tsarfaty, R. (2018). Representations and Architectures in Neural Sentiment Analysis for Morphologically Rich Languages: A Case Study from Modern Hebrew. Proceedings of COLING 2018, pp. 2242–2252. (hebrew_sentiment dataset)</w:t>
       </w:r>
     </w:p>
     <w:p>
@@ -5852,7 +5922,103 @@
         <w:spacing w:after="60"/>
       </w:pPr>
       <w:r>
-        <w:t xml:space="preserve">HebNLI (HebArabNlpProject) and HeQ (Etelis et al., 2023) dataset cards, HuggingFace.</w:t>
+        <w:t xml:space="preserve">Cohen, A., Merhav-Fine, H., Goldberg, Y., and Tsarfaty, R. (2023). HeQ: a Large and Diverse Hebrew Reading Comprehension Benchmark. Findings of EMNLP 2023, pp. 13693–13705. (HeQ dataset)</w:t>
+      </w:r>
+    </w:p>
+    <w:p>
+      <w:pPr>
+        <w:pStyle w:val="ListParagraph"/>
+        <w:numPr>
+          <w:ilvl w:val="0"/>
+          <w:numId w:val="2"/>
+        </w:numPr>
+        <w:spacing w:after="60"/>
+      </w:pPr>
+      <w:r>
+        <w:t xml:space="preserve">HebNLI (HebArabNlpProject), dataset card, HuggingFace.</w:t>
+      </w:r>
+    </w:p>
+    <w:p>
+      <w:pPr>
+        <w:pStyle w:val="Heading1"/>
+        <w:spacing w:after="140" w:before="280"/>
+      </w:pPr>
+      <w:r>
+        <w:t xml:space="preserve">Appendix A: Prompt templates</w:t>
+      </w:r>
+    </w:p>
+    <w:p>
+      <w:pPr>
+        <w:spacing w:after="120"/>
+        <w:jc w:val="both"/>
+      </w:pPr>
+      <w:r>
+        <w:t xml:space="preserve">For transparency, the exact task templates (identical across conditions; the {prefix} slot carries the condition text — empty for raw, the segmentation note for segmented, the morphology instruction for prompt_guided):</w:t>
+      </w:r>
+    </w:p>
+    <w:p>
+      <w:pPr>
+        <w:pStyle w:val="ListParagraph"/>
+        <w:numPr>
+          <w:ilvl w:val="0"/>
+          <w:numId w:val="2"/>
+        </w:numPr>
+        <w:spacing w:after="60"/>
+      </w:pPr>
+      <w:r>
+        <w:t xml:space="preserve">Sentiment: "{prefix}You are given a comment written in Hebrew, posted on the Facebook page of Israel’s president. Classify its sentiment toward the president/post as exactly one of: positive, negative, off-topic. (off-topic means the comment does not relate to the post at all.) Comment: {text} Answer with one word only: positive, negative, or off-topic."</w:t>
+      </w:r>
+    </w:p>
+    <w:p>
+      <w:pPr>
+        <w:pStyle w:val="ListParagraph"/>
+        <w:numPr>
+          <w:ilvl w:val="0"/>
+          <w:numId w:val="2"/>
+        </w:numPr>
+        <w:spacing w:after="60"/>
+      </w:pPr>
+      <w:r>
+        <w:t xml:space="preserve">NLI: "{prefix}You are given a premise and a hypothesis in Hebrew. Decide the relationship between them: entailment (the premise implies the hypothesis), contradiction (they cannot both be true), or neutral (neither). Premise: {premise} Hypothesis: {hypothesis} Answer with one word only: entailment, contradiction, or neutral."</w:t>
+      </w:r>
+    </w:p>
+    <w:p>
+      <w:pPr>
+        <w:pStyle w:val="ListParagraph"/>
+        <w:numPr>
+          <w:ilvl w:val="0"/>
+          <w:numId w:val="2"/>
+        </w:numPr>
+        <w:spacing w:after="60"/>
+      </w:pPr>
+      <w:r>
+        <w:t xml:space="preserve">QA: "{prefix}Read the Hebrew paragraph and answer the question. Answer ONLY with the shortest exact span copied from the paragraph, in Hebrew. Do not add explanations. Paragraph: {context} Question: {question} Answer:"</w:t>
+      </w:r>
+    </w:p>
+    <w:p>
+      <w:pPr>
+        <w:pStyle w:val="ListParagraph"/>
+        <w:numPr>
+          <w:ilvl w:val="0"/>
+          <w:numId w:val="2"/>
+        </w:numPr>
+        <w:spacing w:after="60"/>
+      </w:pPr>
+      <w:r>
+        <w:t xml:space="preserve">Segmented-condition note: "Note: the Hebrew text below has been morphologically segmented — each word is split into its component morphemes, separated by spaces."</w:t>
+      </w:r>
+    </w:p>
+    <w:p>
+      <w:pPr>
+        <w:pStyle w:val="ListParagraph"/>
+        <w:numPr>
+          <w:ilvl w:val="0"/>
+          <w:numId w:val="2"/>
+        </w:numPr>
+        <w:spacing w:after="60"/>
+      </w:pPr>
+      <w:r>
+        <w:t xml:space="preserve">Prompt-guided instruction (winning variant v2): "Hebrew is a morphologically rich language: a single written word may bundle a conjunction, a preposition, the definite article, a content stem, and a pronominal suffix. For example, וכשהלכתי is ו (and) + כש (when) + הלכ (walked) + תי (I) — a whole clause in one word. Common prefixes: ו (and), ש (that/which), ה (the), ל (to), ב (in), מ (from), כ (as/like), כש (when). Suffixes mark possession or object pronouns (ביתו = בית + שלו). While reading the text below, mentally decompose every word into its morphemes before deciding your answer."</w:t>
       </w:r>
     </w:p>
     <w:sectPr>

</xml_diff>